<commit_message>
feat(resume): generate all resume versions from conteudo.py and drop old sources
Co-Authored-By: Claude Opus 5.5 <noreply@anthropic.com>
</commit_message>
<xml_diff>
--- a/Lucas-Bueno-Cesario-Curriculo-Analise.docx
+++ b/Lucas-Bueno-Cesario-Curriculo-Analise.docx
@@ -11,7 +11,6 @@
         <w:rPr>
           <w:rFonts w:ascii="Arial" w:hAnsi="Arial" w:cs="Arial" w:eastAsia="Arial"/>
           <w:b/>
-          <w:i w:val="0"/>
           <w:color w:val="000000"/>
           <w:sz w:val="40"/>
         </w:rPr>
@@ -27,7 +26,6 @@
         <w:rPr>
           <w:rFonts w:ascii="Arial" w:hAnsi="Arial" w:cs="Arial" w:eastAsia="Arial"/>
           <w:b w:val="0"/>
-          <w:i w:val="0"/>
           <w:color w:val="000000"/>
           <w:sz w:val="20"/>
         </w:rPr>
@@ -42,7 +40,6 @@
         <w:rPr>
           <w:rFonts w:ascii="Arial" w:hAnsi="Arial" w:cs="Arial" w:eastAsia="Arial"/>
           <w:b/>
-          <w:i w:val="0"/>
           <w:color w:val="000000"/>
           <w:sz w:val="20"/>
         </w:rPr>
@@ -52,7 +49,6 @@
         <w:rPr>
           <w:rFonts w:ascii="Arial" w:hAnsi="Arial" w:cs="Arial" w:eastAsia="Arial"/>
           <w:b w:val="0"/>
-          <w:i w:val="0"/>
           <w:color w:val="000000"/>
           <w:sz w:val="20"/>
         </w:rPr>
@@ -67,7 +63,6 @@
         <w:rPr>
           <w:rFonts w:ascii="Arial" w:hAnsi="Arial" w:cs="Arial" w:eastAsia="Arial"/>
           <w:b/>
-          <w:i w:val="0"/>
           <w:color w:val="000000"/>
           <w:sz w:val="20"/>
         </w:rPr>
@@ -77,7 +72,6 @@
         <w:rPr>
           <w:rFonts w:ascii="Arial" w:hAnsi="Arial" w:cs="Arial" w:eastAsia="Arial"/>
           <w:b w:val="0"/>
-          <w:i w:val="0"/>
           <w:color w:val="000000"/>
           <w:sz w:val="20"/>
         </w:rPr>
@@ -92,7 +86,6 @@
         <w:rPr>
           <w:rFonts w:ascii="Arial" w:hAnsi="Arial" w:cs="Arial" w:eastAsia="Arial"/>
           <w:b/>
-          <w:i w:val="0"/>
           <w:color w:val="000000"/>
           <w:sz w:val="20"/>
         </w:rPr>
@@ -102,7 +95,6 @@
         <w:rPr>
           <w:rFonts w:ascii="Arial" w:hAnsi="Arial" w:cs="Arial" w:eastAsia="Arial"/>
           <w:b w:val="0"/>
-          <w:i w:val="0"/>
           <w:color w:val="000000"/>
           <w:sz w:val="20"/>
         </w:rPr>
@@ -117,7 +109,6 @@
         <w:rPr>
           <w:rFonts w:ascii="Arial" w:hAnsi="Arial" w:cs="Arial" w:eastAsia="Arial"/>
           <w:b/>
-          <w:i w:val="0"/>
           <w:color w:val="000000"/>
           <w:sz w:val="20"/>
         </w:rPr>
@@ -127,7 +118,6 @@
         <w:rPr>
           <w:rFonts w:ascii="Arial" w:hAnsi="Arial" w:cs="Arial" w:eastAsia="Arial"/>
           <w:b w:val="0"/>
-          <w:i w:val="0"/>
           <w:color w:val="000000"/>
           <w:sz w:val="20"/>
         </w:rPr>
@@ -142,7 +132,6 @@
         <w:rPr>
           <w:rFonts w:ascii="Arial" w:hAnsi="Arial" w:cs="Arial" w:eastAsia="Arial"/>
           <w:b/>
-          <w:i w:val="0"/>
           <w:color w:val="000000"/>
           <w:sz w:val="20"/>
         </w:rPr>
@@ -152,7 +141,6 @@
         <w:rPr>
           <w:rFonts w:ascii="Arial" w:hAnsi="Arial" w:cs="Arial" w:eastAsia="Arial"/>
           <w:b w:val="0"/>
-          <w:i w:val="0"/>
           <w:color w:val="000000"/>
           <w:sz w:val="20"/>
         </w:rPr>
@@ -167,7 +155,6 @@
         <w:rPr>
           <w:rFonts w:ascii="Arial" w:hAnsi="Arial" w:cs="Arial" w:eastAsia="Arial"/>
           <w:b/>
-          <w:i w:val="0"/>
           <w:color w:val="000000"/>
           <w:sz w:val="20"/>
         </w:rPr>
@@ -177,7 +164,6 @@
         <w:rPr>
           <w:rFonts w:ascii="Arial" w:hAnsi="Arial" w:cs="Arial" w:eastAsia="Arial"/>
           <w:b w:val="0"/>
-          <w:i w:val="0"/>
           <w:color w:val="000000"/>
           <w:sz w:val="20"/>
         </w:rPr>
@@ -192,7 +178,6 @@
         <w:rPr>
           <w:rFonts w:ascii="Arial" w:hAnsi="Arial" w:cs="Arial" w:eastAsia="Arial"/>
           <w:b/>
-          <w:i w:val="0"/>
           <w:color w:val="000000"/>
           <w:sz w:val="20"/>
         </w:rPr>
@@ -202,7 +187,6 @@
         <w:rPr>
           <w:rFonts w:ascii="Arial" w:hAnsi="Arial" w:cs="Arial" w:eastAsia="Arial"/>
           <w:b w:val="0"/>
-          <w:i w:val="0"/>
           <w:color w:val="000000"/>
           <w:sz w:val="20"/>
         </w:rPr>
@@ -217,7 +201,6 @@
         <w:rPr>
           <w:rFonts w:ascii="Arial" w:hAnsi="Arial" w:cs="Arial" w:eastAsia="Arial"/>
           <w:b/>
-          <w:i w:val="0"/>
           <w:color w:val="000000"/>
           <w:sz w:val="20"/>
         </w:rPr>
@@ -227,11 +210,10 @@
         <w:rPr>
           <w:rFonts w:ascii="Arial" w:hAnsi="Arial" w:cs="Arial" w:eastAsia="Arial"/>
           <w:b w:val="0"/>
-          <w:i w:val="0"/>
           <w:color w:val="000000"/>
           <w:sz w:val="20"/>
         </w:rPr>
-        <w:t>Desenvolvedor Java Full Stack Senior</w:t>
+        <w:t>Desenvolvedor Java Full Stack Pleno/Sênior</w:t>
       </w:r>
     </w:p>
     <w:p>
@@ -242,7 +224,6 @@
         <w:rPr>
           <w:rFonts w:ascii="Arial" w:hAnsi="Arial" w:cs="Arial" w:eastAsia="Arial"/>
           <w:b/>
-          <w:i w:val="0"/>
           <w:color w:val="000000"/>
           <w:sz w:val="20"/>
         </w:rPr>
@@ -252,7 +233,6 @@
         <w:rPr>
           <w:rFonts w:ascii="Arial" w:hAnsi="Arial" w:cs="Arial" w:eastAsia="Arial"/>
           <w:b w:val="0"/>
-          <w:i w:val="0"/>
           <w:color w:val="000000"/>
           <w:sz w:val="20"/>
         </w:rPr>
@@ -271,7 +251,6 @@
         <w:rPr>
           <w:rFonts w:ascii="Arial" w:hAnsi="Arial" w:cs="Arial" w:eastAsia="Arial"/>
           <w:b/>
-          <w:i w:val="0"/>
           <w:color w:val="000000"/>
           <w:sz w:val="23"/>
         </w:rPr>
@@ -287,11 +266,10 @@
         <w:rPr>
           <w:rFonts w:ascii="Arial" w:hAnsi="Arial" w:cs="Arial" w:eastAsia="Arial"/>
           <w:b w:val="0"/>
-          <w:i w:val="0"/>
           <w:color w:val="000000"/>
           <w:sz w:val="20"/>
         </w:rPr>
-        <w:t>Engenheiro de software com quase 7 anos de experiência, com foco em back-end Java/Spring Boot e atuação full stack em React e Angular (JS/TS). Projetei e entreguei arquiteturas de microsserviços processando milhões de transações diárias, com bancos SQL e NoSQL e nuvem (Azure, AWS, GCP). Adoto desenvolvimento assistido por IA com Spec Driven Development (Cursor, Claude Code).</w:t>
+        <w:t>Desenvolvedor Java Full Stack Pleno/Sênior com 7 anos de carreira, 4 deles em Java (8 a 21) com Spring Boot, Spring Data JPA/Hibernate e Maven. Microsserviços e APIs REST em sistemas críticos: milhões de transações financeiras diárias na Luizalabs (Magazine Luiza), notas fiscais eletrônicas (NF-e) na Cast Group e o programa de fidelidade da Vivo. Front-end em Angular e React com TypeScript; SQL com Oracle, PostgreSQL e Azure SQL; Docker, Kubernetes e CI/CD (Azure DevOps, GitLab CI/CD, Jenkins); nuvem Azure, AWS e GCP; testes com JUnit e Mockito; Scrum e Kanban. Desenvolvimento assistido por IA com Spec Driven Development (Cursor, Claude Code).</w:t>
       </w:r>
     </w:p>
     <w:p>
@@ -303,7 +281,6 @@
         <w:rPr>
           <w:rFonts w:ascii="Arial" w:hAnsi="Arial" w:cs="Arial" w:eastAsia="Arial"/>
           <w:b w:val="0"/>
-          <w:i w:val="0"/>
           <w:color w:val="000000"/>
           <w:sz w:val="20"/>
         </w:rPr>
@@ -322,7 +299,6 @@
         <w:rPr>
           <w:rFonts w:ascii="Arial" w:hAnsi="Arial" w:cs="Arial" w:eastAsia="Arial"/>
           <w:b/>
-          <w:i w:val="0"/>
           <w:color w:val="000000"/>
           <w:sz w:val="23"/>
         </w:rPr>
@@ -337,7 +313,6 @@
         <w:rPr>
           <w:rFonts w:ascii="Arial" w:hAnsi="Arial" w:cs="Arial" w:eastAsia="Arial"/>
           <w:b/>
-          <w:i w:val="0"/>
           <w:color w:val="000000"/>
           <w:sz w:val="20"/>
         </w:rPr>
@@ -347,11 +322,10 @@
         <w:rPr>
           <w:rFonts w:ascii="Arial" w:hAnsi="Arial" w:cs="Arial" w:eastAsia="Arial"/>
           <w:b w:val="0"/>
-          <w:i w:val="0"/>
           <w:color w:val="000000"/>
           <w:sz w:val="20"/>
         </w:rPr>
-        <w:t>Java (incluindo Java 21), TypeScript, JavaScript, Python, PHP, SQL</w:t>
+        <w:t>Java (8 a 21), TypeScript, JavaScript, Python, PHP, SQL</w:t>
       </w:r>
     </w:p>
     <w:p>
@@ -362,7 +336,6 @@
         <w:rPr>
           <w:rFonts w:ascii="Arial" w:hAnsi="Arial" w:cs="Arial" w:eastAsia="Arial"/>
           <w:b/>
-          <w:i w:val="0"/>
           <w:color w:val="000000"/>
           <w:sz w:val="20"/>
         </w:rPr>
@@ -372,11 +345,10 @@
         <w:rPr>
           <w:rFonts w:ascii="Arial" w:hAnsi="Arial" w:cs="Arial" w:eastAsia="Arial"/>
           <w:b w:val="0"/>
-          <w:i w:val="0"/>
           <w:color w:val="000000"/>
           <w:sz w:val="20"/>
         </w:rPr>
-        <w:t>Spring Boot, Spring MVC, Hibernate, jOOQ, APIs RESTful, Microsserviços, BFF (Backend for Frontend), Nest.js, Virtual Threads, Laravel, Zend</w:t>
+        <w:t>Spring Boot, Spring MVC, Spring Data JPA, Hibernate, jOOQ, Maven, Microsserviços (Microservices), APIs REST (RESTful), OpenAPI, Swagger, BFF (Backend for Frontend), NestJS, Node.js, Virtual Threads, Laravel, Zend</w:t>
       </w:r>
     </w:p>
     <w:p>
@@ -387,7 +359,6 @@
         <w:rPr>
           <w:rFonts w:ascii="Arial" w:hAnsi="Arial" w:cs="Arial" w:eastAsia="Arial"/>
           <w:b/>
-          <w:i w:val="0"/>
           <w:color w:val="000000"/>
           <w:sz w:val="20"/>
         </w:rPr>
@@ -397,11 +368,10 @@
         <w:rPr>
           <w:rFonts w:ascii="Arial" w:hAnsi="Arial" w:cs="Arial" w:eastAsia="Arial"/>
           <w:b w:val="0"/>
-          <w:i w:val="0"/>
           <w:color w:val="000000"/>
           <w:sz w:val="20"/>
         </w:rPr>
-        <w:t>React, Redux, Micro Front-ends, Angular, AngularJS, Ionic, React Native, PWA, Leaflet</w:t>
+        <w:t>Angular 8, AngularJS, React, Redux, Micro Front-ends, React Native, Ionic, PWA, Leaflet</w:t>
       </w:r>
     </w:p>
     <w:p>
@@ -412,7 +382,6 @@
         <w:rPr>
           <w:rFonts w:ascii="Arial" w:hAnsi="Arial" w:cs="Arial" w:eastAsia="Arial"/>
           <w:b/>
-          <w:i w:val="0"/>
           <w:color w:val="000000"/>
           <w:sz w:val="20"/>
         </w:rPr>
@@ -422,11 +391,10 @@
         <w:rPr>
           <w:rFonts w:ascii="Arial" w:hAnsi="Arial" w:cs="Arial" w:eastAsia="Arial"/>
           <w:b w:val="0"/>
-          <w:i w:val="0"/>
           <w:color w:val="000000"/>
           <w:sz w:val="20"/>
         </w:rPr>
-        <w:t>PostgreSQL, Oracle Database, Azure SQL, MySQL, MongoDB, Elasticsearch</w:t>
+        <w:t>Oracle Database, PostgreSQL, Azure SQL, MySQL, MongoDB, Elasticsearch</w:t>
       </w:r>
     </w:p>
     <w:p>
@@ -437,21 +405,19 @@
         <w:rPr>
           <w:rFonts w:ascii="Arial" w:hAnsi="Arial" w:cs="Arial" w:eastAsia="Arial"/>
           <w:b/>
-          <w:i w:val="0"/>
           <w:color w:val="000000"/>
           <w:sz w:val="20"/>
         </w:rPr>
-        <w:t xml:space="preserve">Cloud e DevOps: </w:t>
+        <w:t xml:space="preserve">Mensageria e dados: </w:t>
       </w:r>
       <w:r>
         <w:rPr>
           <w:rFonts w:ascii="Arial" w:hAnsi="Arial" w:cs="Arial" w:eastAsia="Arial"/>
           <w:b w:val="0"/>
-          <w:i w:val="0"/>
           <w:color w:val="000000"/>
           <w:sz w:val="20"/>
         </w:rPr>
-        <w:t>Azure, Azure DevOps (Boards, Repos, Pipelines), AWS (EC2, S3, RDS), GCP, Magalu Cloud, Docker, Kubernetes, ArgoCD, Jenkins, GitLab CI/CD, Azure Blob Storage, Linux, Git, SVN</w:t>
+        <w:t>RabbitMQ, Apache Spark, Apache Airflow, Machine Learning</w:t>
       </w:r>
     </w:p>
     <w:p>
@@ -462,21 +428,19 @@
         <w:rPr>
           <w:rFonts w:ascii="Arial" w:hAnsi="Arial" w:cs="Arial" w:eastAsia="Arial"/>
           <w:b/>
-          <w:i w:val="0"/>
           <w:color w:val="000000"/>
           <w:sz w:val="20"/>
         </w:rPr>
-        <w:t xml:space="preserve">Dados e mensageria: </w:t>
+        <w:t xml:space="preserve">Cloud e DevOps: </w:t>
       </w:r>
       <w:r>
         <w:rPr>
           <w:rFonts w:ascii="Arial" w:hAnsi="Arial" w:cs="Arial" w:eastAsia="Arial"/>
           <w:b w:val="0"/>
-          <w:i w:val="0"/>
           <w:color w:val="000000"/>
           <w:sz w:val="20"/>
         </w:rPr>
-        <w:t>Apache Spark, Apache Airflow, RabbitMQ, Machine Learning, data lake</w:t>
+        <w:t>Docker, Kubernetes, ArgoCD, Azure, Azure DevOps, Azure Blob Storage, AWS (EC2, S3, RDS), GCP, Magalu Cloud, GitLab CI/CD, Jenkins, Git, Git flow, Linux, rsync, SVN</w:t>
       </w:r>
     </w:p>
     <w:p>
@@ -487,7 +451,6 @@
         <w:rPr>
           <w:rFonts w:ascii="Arial" w:hAnsi="Arial" w:cs="Arial" w:eastAsia="Arial"/>
           <w:b/>
-          <w:i w:val="0"/>
           <w:color w:val="000000"/>
           <w:sz w:val="20"/>
         </w:rPr>
@@ -497,11 +460,10 @@
         <w:rPr>
           <w:rFonts w:ascii="Arial" w:hAnsi="Arial" w:cs="Arial" w:eastAsia="Arial"/>
           <w:b w:val="0"/>
-          <w:i w:val="0"/>
           <w:color w:val="000000"/>
           <w:sz w:val="20"/>
         </w:rPr>
-        <w:t>JUnit, Mockito, Jest, SonarQube, Selenium, code review</w:t>
+        <w:t>JUnit, Mockito, Jest, SonarQube, Selenium</w:t>
       </w:r>
     </w:p>
     <w:p>
@@ -512,7 +474,6 @@
         <w:rPr>
           <w:rFonts w:ascii="Arial" w:hAnsi="Arial" w:cs="Arial" w:eastAsia="Arial"/>
           <w:b/>
-          <w:i w:val="0"/>
           <w:color w:val="000000"/>
           <w:sz w:val="20"/>
         </w:rPr>
@@ -522,11 +483,10 @@
         <w:rPr>
           <w:rFonts w:ascii="Arial" w:hAnsi="Arial" w:cs="Arial" w:eastAsia="Arial"/>
           <w:b w:val="0"/>
-          <w:i w:val="0"/>
           <w:color w:val="000000"/>
           <w:sz w:val="20"/>
         </w:rPr>
-        <w:t>JWT, Keycloak, LDAP, Apigee / API Gateway, OpenAPI, Swagger, integração com SAP</w:t>
+        <w:t>JWT, Keycloak, OAuth2, LDAP, Apigee (API Gateway), integração com SAP</w:t>
       </w:r>
     </w:p>
     <w:p>
@@ -537,7 +497,29 @@
         <w:rPr>
           <w:rFonts w:ascii="Arial" w:hAnsi="Arial" w:cs="Arial" w:eastAsia="Arial"/>
           <w:b/>
-          <w:i w:val="0"/>
+          <w:color w:val="000000"/>
+          <w:sz w:val="20"/>
+        </w:rPr>
+        <w:t xml:space="preserve">Metodologias: </w:t>
+      </w:r>
+      <w:r>
+        <w:rPr>
+          <w:rFonts w:ascii="Arial" w:hAnsi="Arial" w:cs="Arial" w:eastAsia="Arial"/>
+          <w:b w:val="0"/>
+          <w:color w:val="000000"/>
+          <w:sz w:val="20"/>
+        </w:rPr>
+        <w:t>Metodologias ágeis (Scrum, Kanban)</w:t>
+      </w:r>
+    </w:p>
+    <w:p>
+      <w:pPr>
+        <w:spacing w:before="0" w:after="20" w:line="259" w:lineRule="auto"/>
+      </w:pPr>
+      <w:r>
+        <w:rPr>
+          <w:rFonts w:ascii="Arial" w:hAnsi="Arial" w:cs="Arial" w:eastAsia="Arial"/>
+          <w:b/>
           <w:color w:val="000000"/>
           <w:sz w:val="20"/>
         </w:rPr>
@@ -547,7 +529,6 @@
         <w:rPr>
           <w:rFonts w:ascii="Arial" w:hAnsi="Arial" w:cs="Arial" w:eastAsia="Arial"/>
           <w:b w:val="0"/>
-          <w:i w:val="0"/>
           <w:color w:val="000000"/>
           <w:sz w:val="20"/>
         </w:rPr>
@@ -562,7 +543,6 @@
         <w:rPr>
           <w:rFonts w:ascii="Arial" w:hAnsi="Arial" w:cs="Arial" w:eastAsia="Arial"/>
           <w:b/>
-          <w:i w:val="0"/>
           <w:color w:val="000000"/>
           <w:sz w:val="20"/>
         </w:rPr>
@@ -572,11 +552,10 @@
         <w:rPr>
           <w:rFonts w:ascii="Arial" w:hAnsi="Arial" w:cs="Arial" w:eastAsia="Arial"/>
           <w:b w:val="0"/>
-          <w:i w:val="0"/>
           <w:color w:val="000000"/>
           <w:sz w:val="20"/>
         </w:rPr>
-        <w:t>Azure Boards, Jira, Grafana</w:t>
+        <w:t>Jira, Grafana</w:t>
       </w:r>
     </w:p>
     <w:p>
@@ -591,7 +570,6 @@
         <w:rPr>
           <w:rFonts w:ascii="Arial" w:hAnsi="Arial" w:cs="Arial" w:eastAsia="Arial"/>
           <w:b/>
-          <w:i w:val="0"/>
           <w:color w:val="000000"/>
           <w:sz w:val="23"/>
         </w:rPr>
@@ -607,7 +585,6 @@
         <w:rPr>
           <w:rFonts w:ascii="Arial" w:hAnsi="Arial" w:cs="Arial" w:eastAsia="Arial"/>
           <w:b/>
-          <w:i w:val="0"/>
           <w:color w:val="000000"/>
           <w:sz w:val="22"/>
         </w:rPr>
@@ -616,14 +593,13 @@
     </w:p>
     <w:p>
       <w:pPr>
-        <w:spacing w:before="0" w:after="0" w:line="259" w:lineRule="auto"/>
+        <w:spacing w:before="0" w:after="20" w:line="259" w:lineRule="auto"/>
         <w:jc w:val="left"/>
       </w:pPr>
       <w:r>
         <w:rPr>
           <w:rFonts w:ascii="Arial" w:hAnsi="Arial" w:cs="Arial" w:eastAsia="Arial"/>
           <w:b w:val="0"/>
-          <w:i w:val="0"/>
           <w:color w:val="000000"/>
           <w:sz w:val="20"/>
         </w:rPr>
@@ -632,14 +608,13 @@
     </w:p>
     <w:p>
       <w:pPr>
-        <w:spacing w:before="0" w:after="0" w:line="259" w:lineRule="auto"/>
+        <w:spacing w:before="0" w:after="20" w:line="259" w:lineRule="auto"/>
         <w:jc w:val="left"/>
       </w:pPr>
       <w:r>
         <w:rPr>
           <w:rFonts w:ascii="Arial" w:hAnsi="Arial" w:cs="Arial" w:eastAsia="Arial"/>
           <w:b w:val="0"/>
-          <w:i w:val="0"/>
           <w:color w:val="000000"/>
           <w:sz w:val="20"/>
         </w:rPr>
@@ -655,7 +630,6 @@
         <w:rPr>
           <w:rFonts w:ascii="Arial" w:hAnsi="Arial" w:cs="Arial" w:eastAsia="Arial"/>
           <w:b w:val="0"/>
-          <w:i w:val="0"/>
           <w:color w:val="000000"/>
           <w:sz w:val="20"/>
         </w:rPr>
@@ -672,11 +646,10 @@
         <w:rPr>
           <w:rFonts w:ascii="Arial" w:hAnsi="Arial" w:cs="Arial" w:eastAsia="Arial"/>
           <w:b w:val="0"/>
-          <w:i w:val="0"/>
           <w:color w:val="000000"/>
           <w:sz w:val="20"/>
         </w:rPr>
-        <w:t>Refatorei o sistema web de administração do Vivo Valoriza (programa de benefícios do app da Vivo), modernizando uma arquitetura distribuída com microsserviços em Java, camada de BFF (Backend for Frontend) em Nest.js e micro front-ends em React.</w:t>
+        <w:t>Refatorei o sistema web de administração do Vivo Valoriza (programa de benefícios do app da Vivo), modernizando uma arquitetura distribuída com microsserviços em Java e Spring Boot, camada de BFF (Backend for Frontend) em NestJS (Node.js), micro front-ends em React e mensageria em RabbitMQ.</w:t>
       </w:r>
     </w:p>
     <w:p>
@@ -689,11 +662,10 @@
         <w:rPr>
           <w:rFonts w:ascii="Arial" w:hAnsi="Arial" w:cs="Arial" w:eastAsia="Arial"/>
           <w:b w:val="0"/>
-          <w:i w:val="0"/>
           <w:color w:val="000000"/>
           <w:sz w:val="20"/>
         </w:rPr>
-        <w:t>Adotei Spec Driven Development com agentes de IA (Cursor e Claude Code) e o plugin Superpowers, aplicando fluxos de brainstorming, escrita e execução de planos para aumentar a previsibilidade e a qualidade das entregas.</w:t>
+        <w:t>Adotei Spec Driven Development com agentes de IA (Cursor e Claude Code), com especificação, plano e execução revisados em cada etapa para aumentar a previsibilidade e a qualidade das entregas.</w:t>
       </w:r>
     </w:p>
     <w:p>
@@ -706,11 +678,10 @@
         <w:rPr>
           <w:rFonts w:ascii="Arial" w:hAnsi="Arial" w:cs="Arial" w:eastAsia="Arial"/>
           <w:b w:val="0"/>
-          <w:i w:val="0"/>
           <w:color w:val="000000"/>
           <w:sz w:val="20"/>
         </w:rPr>
-        <w:t>Conduzi o ciclo de entrega no Azure DevOps - Boards para planejamento, Repos para versionamento e Pipelines de CI/CD - e alternava entre os ambientes da Zukk e da Vivo para extrair o legado da Vivo e refatorá-lo dentro do ambiente da Zukk.</w:t>
+        <w:t>Conduzi o ciclo de entrega no Azure DevOps: Boards para planejamento, Repos para versionamento com Git flow e code review, e Pipelines de CI/CD.</w:t>
       </w:r>
     </w:p>
     <w:p>
@@ -721,7 +692,6 @@
         <w:rPr>
           <w:rFonts w:ascii="Arial" w:hAnsi="Arial" w:cs="Arial" w:eastAsia="Arial"/>
           <w:b/>
-          <w:i w:val="0"/>
           <w:color w:val="000000"/>
           <w:sz w:val="19"/>
         </w:rPr>
@@ -731,11 +701,10 @@
         <w:rPr>
           <w:rFonts w:ascii="Arial" w:hAnsi="Arial" w:cs="Arial" w:eastAsia="Arial"/>
           <w:b w:val="0"/>
-          <w:i w:val="0"/>
           <w:color w:val="000000"/>
           <w:sz w:val="19"/>
         </w:rPr>
-        <w:t>Java, Microsserviços, APIs RESTful, React, Micro Front-ends, TypeScript, Nest.js (BFF), JUnit, Mockito, Jest, Azure, Azure DevOps, Azure SQL, Git, Spec Driven Development, Cursor, Claude Code</w:t>
+        <w:t>Java, Spring Boot, Spring Data JPA, Maven, Microsserviços, APIs RESTful, RabbitMQ, NestJS, Node.js, BFF (Backend for Frontend), React, Micro Front-ends, TypeScript, JUnit, Mockito, Jest, Docker, Azure, Azure DevOps, Azure SQL, Git, Git flow, Scrum, Kanban, Spec Driven Development, Cursor, Claude Code</w:t>
       </w:r>
     </w:p>
     <w:p>
@@ -747,7 +716,6 @@
         <w:rPr>
           <w:rFonts w:ascii="Arial" w:hAnsi="Arial" w:cs="Arial" w:eastAsia="Arial"/>
           <w:b/>
-          <w:i w:val="0"/>
           <w:color w:val="000000"/>
           <w:sz w:val="22"/>
         </w:rPr>
@@ -756,14 +724,13 @@
     </w:p>
     <w:p>
       <w:pPr>
-        <w:spacing w:before="0" w:after="0" w:line="259" w:lineRule="auto"/>
+        <w:spacing w:before="0" w:after="20" w:line="259" w:lineRule="auto"/>
         <w:jc w:val="left"/>
       </w:pPr>
       <w:r>
         <w:rPr>
           <w:rFonts w:ascii="Arial" w:hAnsi="Arial" w:cs="Arial" w:eastAsia="Arial"/>
           <w:b w:val="0"/>
-          <w:i w:val="0"/>
           <w:color w:val="000000"/>
           <w:sz w:val="20"/>
         </w:rPr>
@@ -772,14 +739,13 @@
     </w:p>
     <w:p>
       <w:pPr>
-        <w:spacing w:before="0" w:after="0" w:line="259" w:lineRule="auto"/>
+        <w:spacing w:before="0" w:after="20" w:line="259" w:lineRule="auto"/>
         <w:jc w:val="left"/>
       </w:pPr>
       <w:r>
         <w:rPr>
           <w:rFonts w:ascii="Arial" w:hAnsi="Arial" w:cs="Arial" w:eastAsia="Arial"/>
           <w:b w:val="0"/>
-          <w:i w:val="0"/>
           <w:color w:val="000000"/>
           <w:sz w:val="20"/>
         </w:rPr>
@@ -795,7 +761,6 @@
         <w:rPr>
           <w:rFonts w:ascii="Arial" w:hAnsi="Arial" w:cs="Arial" w:eastAsia="Arial"/>
           <w:b w:val="0"/>
-          <w:i w:val="0"/>
           <w:color w:val="000000"/>
           <w:sz w:val="20"/>
         </w:rPr>
@@ -812,11 +777,10 @@
         <w:rPr>
           <w:rFonts w:ascii="Arial" w:hAnsi="Arial" w:cs="Arial" w:eastAsia="Arial"/>
           <w:b w:val="0"/>
-          <w:i w:val="0"/>
           <w:color w:val="000000"/>
           <w:sz w:val="20"/>
         </w:rPr>
-        <w:t>Atuei no desenvolvimento do InvoiceCon, solução de notas fiscais eletrônicas (NF-e), com Java Spring no back-end e Angular no front-end, contribuindo para a migração do sistema às novas regras da Reforma Tributária brasileira.</w:t>
+        <w:t>Atuei no desenvolvimento do InvoiceCon, solução de notas fiscais eletrônicas (NF-e), com Java e Spring Boot no back-end e Angular 8 no front-end, contribuindo para a migração do sistema às novas regras da Reforma Tributária brasileira.</w:t>
       </w:r>
     </w:p>
     <w:p>
@@ -829,7 +793,6 @@
         <w:rPr>
           <w:rFonts w:ascii="Arial" w:hAnsi="Arial" w:cs="Arial" w:eastAsia="Arial"/>
           <w:b w:val="0"/>
-          <w:i w:val="0"/>
           <w:color w:val="000000"/>
           <w:sz w:val="20"/>
         </w:rPr>
@@ -846,7 +809,6 @@
         <w:rPr>
           <w:rFonts w:ascii="Arial" w:hAnsi="Arial" w:cs="Arial" w:eastAsia="Arial"/>
           <w:b w:val="0"/>
-          <w:i w:val="0"/>
           <w:color w:val="000000"/>
           <w:sz w:val="20"/>
         </w:rPr>
@@ -861,7 +823,6 @@
         <w:rPr>
           <w:rFonts w:ascii="Arial" w:hAnsi="Arial" w:cs="Arial" w:eastAsia="Arial"/>
           <w:b/>
-          <w:i w:val="0"/>
           <w:color w:val="000000"/>
           <w:sz w:val="19"/>
         </w:rPr>
@@ -871,11 +832,10 @@
         <w:rPr>
           <w:rFonts w:ascii="Arial" w:hAnsi="Arial" w:cs="Arial" w:eastAsia="Arial"/>
           <w:b w:val="0"/>
-          <w:i w:val="0"/>
           <w:color w:val="000000"/>
           <w:sz w:val="19"/>
         </w:rPr>
-        <w:t>Java, Spring, APIs RESTful, SQL, integração com SAP, Angular, TypeScript, JUnit, Mockito, SonarQube, Azure, Azure SQL, Blob Storage, GitLab CI/CD, Git</w:t>
+        <w:t>Java, Spring Boot, Spring Data JPA, Maven, APIs RESTful, SQL, SAP, Angular 8, TypeScript, JUnit, Mockito, SonarQube, Docker, Azure, Azure SQL, Blob Storage, GitLab CI/CD, Git, Git flow, Scrum, Kanban</w:t>
       </w:r>
     </w:p>
     <w:p>
@@ -887,7 +847,6 @@
         <w:rPr>
           <w:rFonts w:ascii="Arial" w:hAnsi="Arial" w:cs="Arial" w:eastAsia="Arial"/>
           <w:b/>
-          <w:i w:val="0"/>
           <w:color w:val="000000"/>
           <w:sz w:val="22"/>
         </w:rPr>
@@ -896,14 +855,13 @@
     </w:p>
     <w:p>
       <w:pPr>
-        <w:spacing w:before="0" w:after="0" w:line="259" w:lineRule="auto"/>
+        <w:spacing w:before="0" w:after="20" w:line="259" w:lineRule="auto"/>
         <w:jc w:val="left"/>
       </w:pPr>
       <w:r>
         <w:rPr>
           <w:rFonts w:ascii="Arial" w:hAnsi="Arial" w:cs="Arial" w:eastAsia="Arial"/>
           <w:b w:val="0"/>
-          <w:i w:val="0"/>
           <w:color w:val="000000"/>
           <w:sz w:val="20"/>
         </w:rPr>
@@ -912,14 +870,13 @@
     </w:p>
     <w:p>
       <w:pPr>
-        <w:spacing w:before="0" w:after="0" w:line="259" w:lineRule="auto"/>
+        <w:spacing w:before="0" w:after="20" w:line="259" w:lineRule="auto"/>
         <w:jc w:val="left"/>
       </w:pPr>
       <w:r>
         <w:rPr>
           <w:rFonts w:ascii="Arial" w:hAnsi="Arial" w:cs="Arial" w:eastAsia="Arial"/>
           <w:b w:val="0"/>
-          <w:i w:val="0"/>
           <w:color w:val="000000"/>
           <w:sz w:val="20"/>
         </w:rPr>
@@ -935,7 +892,6 @@
         <w:rPr>
           <w:rFonts w:ascii="Arial" w:hAnsi="Arial" w:cs="Arial" w:eastAsia="Arial"/>
           <w:b w:val="0"/>
-          <w:i w:val="0"/>
           <w:color w:val="000000"/>
           <w:sz w:val="20"/>
         </w:rPr>
@@ -952,11 +908,10 @@
         <w:rPr>
           <w:rFonts w:ascii="Arial" w:hAnsi="Arial" w:cs="Arial" w:eastAsia="Arial"/>
           <w:b w:val="0"/>
-          <w:i w:val="0"/>
           <w:color w:val="000000"/>
           <w:sz w:val="20"/>
         </w:rPr>
-        <w:t>Desenvolvi microsserviços financeiros em Java Spring Boot/MVC com autenticação JWT e Keycloak, processando milhões de transações diárias, e interfaces em React/TypeScript para declarações de pagamento (CPF, CNPJ).</w:t>
+        <w:t>Conduzi o upgrade da JVM de 17 para 21 e reescrevi com Virtual Threads a importação em lote de ~100 mil faturas: de mais de 10 minutos para cerca de 1 minuto.</w:t>
       </w:r>
     </w:p>
     <w:p>
@@ -969,11 +924,10 @@
         <w:rPr>
           <w:rFonts w:ascii="Arial" w:hAnsi="Arial" w:cs="Arial" w:eastAsia="Arial"/>
           <w:b w:val="0"/>
-          <w:i w:val="0"/>
           <w:color w:val="000000"/>
           <w:sz w:val="20"/>
         </w:rPr>
-        <w:t>Atuei como "bombeiro da semana", resolvendo cards de suporte N3 e bugs críticos de produção; mantive ~95% de cobertura de código com JUnit, Mockito e SonarQube.</w:t>
+        <w:t>Desenvolvi microsserviços financeiros em Java, Spring Boot e Spring MVC com Spring Data JPA/Hibernate sobre Oracle, autenticação JWT e Keycloak, processando milhões de transações financeiras diárias, e interfaces em React/TypeScript para declarações de pagamento (CPF, CNPJ).</w:t>
       </w:r>
     </w:p>
     <w:p>
@@ -986,11 +940,10 @@
         <w:rPr>
           <w:rFonts w:ascii="Arial" w:hAnsi="Arial" w:cs="Arial" w:eastAsia="Arial"/>
           <w:b w:val="0"/>
-          <w:i w:val="0"/>
           <w:color w:val="000000"/>
           <w:sz w:val="20"/>
         </w:rPr>
-        <w:t>Construí APIs RESTful com Apigee/API Gateway (OpenAPI) e mantive pipelines de dados com Python, Apache Spark e Apache Airflow, incluindo a repopulação do data lake a partir do Oracle EBS.</w:t>
+        <w:t>Atuei como "bombeiro da semana", resolvendo incidentes críticos de produção e cards de suporte N3 com observabilidade no Grafana; mantive ~95% de cobertura de código com JUnit, Mockito e SonarQube.</w:t>
       </w:r>
     </w:p>
     <w:p>
@@ -1003,28 +956,10 @@
         <w:rPr>
           <w:rFonts w:ascii="Arial" w:hAnsi="Arial" w:cs="Arial" w:eastAsia="Arial"/>
           <w:b w:val="0"/>
-          <w:i w:val="0"/>
           <w:color w:val="000000"/>
           <w:sz w:val="20"/>
         </w:rPr>
-        <w:t>Otimizei o processamento em lote de faturas com Virtual Threads (Java 21), reduzindo a importação de ~100 mil registros de vários minutos para cerca de um minuto.</w:t>
-      </w:r>
-    </w:p>
-    <w:p>
-      <w:pPr>
-        <w:pStyle w:val="ListBullet"/>
-        <w:spacing w:before="0" w:after="40" w:line="259" w:lineRule="auto"/>
-        <w:ind w:left="357"/>
-      </w:pPr>
-      <w:r>
-        <w:rPr>
-          <w:rFonts w:ascii="Arial" w:hAnsi="Arial" w:cs="Arial" w:eastAsia="Arial"/>
-          <w:b w:val="0"/>
-          <w:i w:val="0"/>
-          <w:color w:val="000000"/>
-          <w:sz w:val="20"/>
-        </w:rPr>
-        <w:t>Tive contato com RabbitMQ, usado no time para reprocessamento manual de mensagens com falha na fila.</w:t>
+        <w:t>Construí APIs RESTful publicadas no Apigee (API Gateway) com contrato OpenAPI e mantive pipelines de dados com Python, Apache Spark e Apache Airflow, incluindo a repopulação do data lake a partir do Oracle EBS.</w:t>
       </w:r>
     </w:p>
     <w:p>
@@ -1035,7 +970,6 @@
         <w:rPr>
           <w:rFonts w:ascii="Arial" w:hAnsi="Arial" w:cs="Arial" w:eastAsia="Arial"/>
           <w:b/>
-          <w:i w:val="0"/>
           <w:color w:val="000000"/>
           <w:sz w:val="19"/>
         </w:rPr>
@@ -1045,11 +979,10 @@
         <w:rPr>
           <w:rFonts w:ascii="Arial" w:hAnsi="Arial" w:cs="Arial" w:eastAsia="Arial"/>
           <w:b w:val="0"/>
-          <w:i w:val="0"/>
           <w:color w:val="000000"/>
           <w:sz w:val="19"/>
         </w:rPr>
-        <w:t>Java 21, Virtual Threads, Spring Boot, Spring MVC, Hibernate, JWT, Keycloak, Microsserviços, RabbitMQ, Apigee, React, TypeScript, JUnit, Mockito, Jest, SonarQube, Oracle Database, Python, Apache Spark, Apache Airflow, Docker, Kubernetes, ArgoCD, Grafana, GCP, Magalu Cloud</w:t>
+        <w:t>Java 21, Virtual Threads, Spring Boot, Spring MVC, Spring Data JPA, Hibernate, Maven, Microsserviços, APIs RESTful, JWT, Keycloak, RabbitMQ, Apigee, OpenAPI, React, TypeScript, JUnit, Mockito, Jest, SonarQube, Oracle Database, Python, Apache Spark, Apache Airflow, Docker, Kubernetes, ArgoCD, Grafana, GCP, Magalu Cloud, Git, Git flow, Scrum, Kanban</w:t>
       </w:r>
     </w:p>
     <w:p>
@@ -1061,7 +994,6 @@
         <w:rPr>
           <w:rFonts w:ascii="Arial" w:hAnsi="Arial" w:cs="Arial" w:eastAsia="Arial"/>
           <w:b/>
-          <w:i w:val="0"/>
           <w:color w:val="000000"/>
           <w:sz w:val="22"/>
         </w:rPr>
@@ -1070,14 +1002,13 @@
     </w:p>
     <w:p>
       <w:pPr>
-        <w:spacing w:before="0" w:after="0" w:line="259" w:lineRule="auto"/>
+        <w:spacing w:before="0" w:after="20" w:line="259" w:lineRule="auto"/>
         <w:jc w:val="left"/>
       </w:pPr>
       <w:r>
         <w:rPr>
           <w:rFonts w:ascii="Arial" w:hAnsi="Arial" w:cs="Arial" w:eastAsia="Arial"/>
           <w:b w:val="0"/>
-          <w:i w:val="0"/>
           <w:color w:val="000000"/>
           <w:sz w:val="20"/>
         </w:rPr>
@@ -1086,14 +1017,13 @@
     </w:p>
     <w:p>
       <w:pPr>
-        <w:spacing w:before="0" w:after="0" w:line="259" w:lineRule="auto"/>
+        <w:spacing w:before="0" w:after="20" w:line="259" w:lineRule="auto"/>
         <w:jc w:val="left"/>
       </w:pPr>
       <w:r>
         <w:rPr>
           <w:rFonts w:ascii="Arial" w:hAnsi="Arial" w:cs="Arial" w:eastAsia="Arial"/>
           <w:b w:val="0"/>
-          <w:i w:val="0"/>
           <w:color w:val="000000"/>
           <w:sz w:val="20"/>
         </w:rPr>
@@ -1109,7 +1039,6 @@
         <w:rPr>
           <w:rFonts w:ascii="Arial" w:hAnsi="Arial" w:cs="Arial" w:eastAsia="Arial"/>
           <w:b w:val="0"/>
-          <w:i w:val="0"/>
           <w:color w:val="000000"/>
           <w:sz w:val="20"/>
         </w:rPr>
@@ -1126,11 +1055,10 @@
         <w:rPr>
           <w:rFonts w:ascii="Arial" w:hAnsi="Arial" w:cs="Arial" w:eastAsia="Arial"/>
           <w:b w:val="0"/>
-          <w:i w:val="0"/>
           <w:color w:val="000000"/>
           <w:sz w:val="20"/>
         </w:rPr>
-        <w:t>Arquitetei e desenvolvi o CLICQ, sistema de inspeção de qualidade alimentar para toda a cadeia (do produtor ao varejo), com backend Spring Boot e frontend React/Redux/TypeScript, além de versões legadas em AngularJS, Angular 8/Ionic e mobile em React Native.</w:t>
+        <w:t>Arquitetei e desenvolvi o CLICQ, sistema de inspeção de qualidade alimentar para toda a cadeia (do produtor ao varejo), com back-end em Java 8 e Spring Boot e front-end em React/Redux/TypeScript, além de versões legadas em AngularJS e Angular 8/Ionic e app mobile em React Native com autenticação OAuth2.</w:t>
       </w:r>
     </w:p>
     <w:p>
@@ -1143,7 +1071,6 @@
         <w:rPr>
           <w:rFonts w:ascii="Arial" w:hAnsi="Arial" w:cs="Arial" w:eastAsia="Arial"/>
           <w:b w:val="0"/>
-          <w:i w:val="0"/>
           <w:color w:val="000000"/>
           <w:sz w:val="20"/>
         </w:rPr>
@@ -1160,11 +1087,10 @@
         <w:rPr>
           <w:rFonts w:ascii="Arial" w:hAnsi="Arial" w:cs="Arial" w:eastAsia="Arial"/>
           <w:b w:val="0"/>
-          <w:i w:val="0"/>
           <w:color w:val="000000"/>
           <w:sz w:val="20"/>
         </w:rPr>
-        <w:t>Atuei como "bombeiro da semana" na prevenção e correção de bugs, com apoio ao suporte N2, monitoramento via Grafana e testes manuais; não havia suíte de testes automatizados, mas mantínhamos uma política forte de code review - nenhum código ia para produção sem aprovação de dois colegas revisores.</w:t>
+        <w:t>Atuei como "bombeiro da semana" na prevenção e correção de bugs, com apoio ao suporte N2, monitoramento via Grafana e testes manuais; não havia suíte de testes automatizados, mas o time seguia Git flow com code review obrigatório: nenhum código ia para produção sem aprovação de dois colegas revisores.</w:t>
       </w:r>
     </w:p>
     <w:p>
@@ -1175,7 +1101,6 @@
         <w:rPr>
           <w:rFonts w:ascii="Arial" w:hAnsi="Arial" w:cs="Arial" w:eastAsia="Arial"/>
           <w:b/>
-          <w:i w:val="0"/>
           <w:color w:val="000000"/>
           <w:sz w:val="19"/>
         </w:rPr>
@@ -1185,11 +1110,10 @@
         <w:rPr>
           <w:rFonts w:ascii="Arial" w:hAnsi="Arial" w:cs="Arial" w:eastAsia="Arial"/>
           <w:b w:val="0"/>
-          <w:i w:val="0"/>
           <w:color w:val="000000"/>
           <w:sz w:val="19"/>
         </w:rPr>
-        <w:t>Java, Spring Boot, jOOQ, Swagger, React, Redux, TypeScript, Angular, Ionic, React Native, PostgreSQL, Python, Machine Learning, AWS (EC2, S3, RDS), Jenkins, Grafana, Jira</w:t>
+        <w:t>Java 8, Spring Boot, Spring Data JPA, jOOQ, Maven, Swagger, OAuth2, React, Redux, TypeScript, Angular 8, AngularJS, Ionic, React Native, PostgreSQL, Python, Machine Learning, Docker, AWS (EC2, S3, RDS), Jenkins, Grafana, Jira, Git, Git flow, Scrum, Kanban</w:t>
       </w:r>
     </w:p>
     <w:p>
@@ -1201,7 +1125,6 @@
         <w:rPr>
           <w:rFonts w:ascii="Arial" w:hAnsi="Arial" w:cs="Arial" w:eastAsia="Arial"/>
           <w:b/>
-          <w:i w:val="0"/>
           <w:color w:val="000000"/>
           <w:sz w:val="22"/>
         </w:rPr>
@@ -1210,30 +1133,28 @@
     </w:p>
     <w:p>
       <w:pPr>
-        <w:spacing w:before="0" w:after="0" w:line="259" w:lineRule="auto"/>
+        <w:spacing w:before="0" w:after="20" w:line="259" w:lineRule="auto"/>
         <w:jc w:val="left"/>
       </w:pPr>
       <w:r>
         <w:rPr>
           <w:rFonts w:ascii="Arial" w:hAnsi="Arial" w:cs="Arial" w:eastAsia="Arial"/>
           <w:b w:val="0"/>
-          <w:i w:val="0"/>
           <w:color w:val="000000"/>
           <w:sz w:val="20"/>
         </w:rPr>
-        <w:t>Secretaria de Segurança Pública</w:t>
+        <w:t>Secretaria de Segurança Pública de SC</w:t>
       </w:r>
     </w:p>
     <w:p>
       <w:pPr>
-        <w:spacing w:before="0" w:after="0" w:line="259" w:lineRule="auto"/>
+        <w:spacing w:before="0" w:after="20" w:line="259" w:lineRule="auto"/>
         <w:jc w:val="left"/>
       </w:pPr>
       <w:r>
         <w:rPr>
           <w:rFonts w:ascii="Arial" w:hAnsi="Arial" w:cs="Arial" w:eastAsia="Arial"/>
           <w:b w:val="0"/>
-          <w:i w:val="0"/>
           <w:color w:val="000000"/>
           <w:sz w:val="20"/>
         </w:rPr>
@@ -1249,7 +1170,6 @@
         <w:rPr>
           <w:rFonts w:ascii="Arial" w:hAnsi="Arial" w:cs="Arial" w:eastAsia="Arial"/>
           <w:b w:val="0"/>
-          <w:i w:val="0"/>
           <w:color w:val="000000"/>
           <w:sz w:val="20"/>
         </w:rPr>
@@ -1266,7 +1186,6 @@
         <w:rPr>
           <w:rFonts w:ascii="Arial" w:hAnsi="Arial" w:cs="Arial" w:eastAsia="Arial"/>
           <w:b w:val="0"/>
-          <w:i w:val="0"/>
           <w:color w:val="000000"/>
           <w:sz w:val="20"/>
         </w:rPr>
@@ -1283,11 +1202,10 @@
         <w:rPr>
           <w:rFonts w:ascii="Arial" w:hAnsi="Arial" w:cs="Arial" w:eastAsia="Arial"/>
           <w:b w:val="0"/>
-          <w:i w:val="0"/>
           <w:color w:val="000000"/>
           <w:sz w:val="20"/>
         </w:rPr>
-        <w:t>Mantive sistemas legados de segurança (Bem-Te-Vi e BRAVO) em PHP com autenticação LDAP.</w:t>
+        <w:t>Mantive sistemas legados de segurança (Bem-Te-Vi e BRAVO) em PHP e Laravel com autenticação LDAP e APIs REST sobre PostgreSQL.</w:t>
       </w:r>
     </w:p>
     <w:p>
@@ -1300,28 +1218,10 @@
         <w:rPr>
           <w:rFonts w:ascii="Arial" w:hAnsi="Arial" w:cs="Arial" w:eastAsia="Arial"/>
           <w:b w:val="0"/>
-          <w:i w:val="0"/>
           <w:color w:val="000000"/>
           <w:sz w:val="20"/>
         </w:rPr>
-        <w:t>Usei RabbitMQ para processamento assíncrono de SMS de ocorrências de placas monitoradas.</w:t>
-      </w:r>
-    </w:p>
-    <w:p>
-      <w:pPr>
-        <w:pStyle w:val="ListBullet"/>
-        <w:spacing w:before="0" w:after="40" w:line="259" w:lineRule="auto"/>
-        <w:ind w:left="357"/>
-      </w:pPr>
-      <w:r>
-        <w:rPr>
-          <w:rFonts w:ascii="Arial" w:hAnsi="Arial" w:cs="Arial" w:eastAsia="Arial"/>
-          <w:b w:val="0"/>
-          <w:i w:val="0"/>
-          <w:color w:val="000000"/>
-          <w:sz w:val="20"/>
-        </w:rPr>
-        <w:t>Integrei Elasticsearch para busca de texto completo.</w:t>
+        <w:t>Usei RabbitMQ para mensageria assíncrona no processamento de SMS de ocorrências de placas monitoradas e integrei Elasticsearch para busca de texto completo.</w:t>
       </w:r>
     </w:p>
     <w:p>
@@ -1332,7 +1232,6 @@
         <w:rPr>
           <w:rFonts w:ascii="Arial" w:hAnsi="Arial" w:cs="Arial" w:eastAsia="Arial"/>
           <w:b/>
-          <w:i w:val="0"/>
           <w:color w:val="000000"/>
           <w:sz w:val="19"/>
         </w:rPr>
@@ -1342,7 +1241,6 @@
         <w:rPr>
           <w:rFonts w:ascii="Arial" w:hAnsi="Arial" w:cs="Arial" w:eastAsia="Arial"/>
           <w:b w:val="0"/>
-          <w:i w:val="0"/>
           <w:color w:val="000000"/>
           <w:sz w:val="19"/>
         </w:rPr>
@@ -1358,7 +1256,6 @@
         <w:rPr>
           <w:rFonts w:ascii="Arial" w:hAnsi="Arial" w:cs="Arial" w:eastAsia="Arial"/>
           <w:b/>
-          <w:i w:val="0"/>
           <w:color w:val="000000"/>
           <w:sz w:val="22"/>
         </w:rPr>
@@ -1367,14 +1264,13 @@
     </w:p>
     <w:p>
       <w:pPr>
-        <w:spacing w:before="0" w:after="0" w:line="259" w:lineRule="auto"/>
+        <w:spacing w:before="0" w:after="20" w:line="259" w:lineRule="auto"/>
         <w:jc w:val="left"/>
       </w:pPr>
       <w:r>
         <w:rPr>
           <w:rFonts w:ascii="Arial" w:hAnsi="Arial" w:cs="Arial" w:eastAsia="Arial"/>
           <w:b w:val="0"/>
-          <w:i w:val="0"/>
           <w:color w:val="000000"/>
           <w:sz w:val="20"/>
         </w:rPr>
@@ -1383,14 +1279,13 @@
     </w:p>
     <w:p>
       <w:pPr>
-        <w:spacing w:before="0" w:after="0" w:line="259" w:lineRule="auto"/>
+        <w:spacing w:before="0" w:after="20" w:line="259" w:lineRule="auto"/>
         <w:jc w:val="left"/>
       </w:pPr>
       <w:r>
         <w:rPr>
           <w:rFonts w:ascii="Arial" w:hAnsi="Arial" w:cs="Arial" w:eastAsia="Arial"/>
           <w:b w:val="0"/>
-          <w:i w:val="0"/>
           <w:color w:val="000000"/>
           <w:sz w:val="20"/>
         </w:rPr>
@@ -1406,7 +1301,6 @@
         <w:rPr>
           <w:rFonts w:ascii="Arial" w:hAnsi="Arial" w:cs="Arial" w:eastAsia="Arial"/>
           <w:b w:val="0"/>
-          <w:i w:val="0"/>
           <w:color w:val="000000"/>
           <w:sz w:val="20"/>
         </w:rPr>
@@ -1423,7 +1317,6 @@
         <w:rPr>
           <w:rFonts w:ascii="Arial" w:hAnsi="Arial" w:cs="Arial" w:eastAsia="Arial"/>
           <w:b w:val="0"/>
-          <w:i w:val="0"/>
           <w:color w:val="000000"/>
           <w:sz w:val="20"/>
         </w:rPr>
@@ -1440,7 +1333,6 @@
         <w:rPr>
           <w:rFonts w:ascii="Arial" w:hAnsi="Arial" w:cs="Arial" w:eastAsia="Arial"/>
           <w:b w:val="0"/>
-          <w:i w:val="0"/>
           <w:color w:val="000000"/>
           <w:sz w:val="20"/>
         </w:rPr>
@@ -1457,7 +1349,6 @@
         <w:rPr>
           <w:rFonts w:ascii="Arial" w:hAnsi="Arial" w:cs="Arial" w:eastAsia="Arial"/>
           <w:b w:val="0"/>
-          <w:i w:val="0"/>
           <w:color w:val="000000"/>
           <w:sz w:val="20"/>
         </w:rPr>
@@ -1472,7 +1363,6 @@
         <w:rPr>
           <w:rFonts w:ascii="Arial" w:hAnsi="Arial" w:cs="Arial" w:eastAsia="Arial"/>
           <w:b/>
-          <w:i w:val="0"/>
           <w:color w:val="000000"/>
           <w:sz w:val="19"/>
         </w:rPr>
@@ -1482,7 +1372,6 @@
         <w:rPr>
           <w:rFonts w:ascii="Arial" w:hAnsi="Arial" w:cs="Arial" w:eastAsia="Arial"/>
           <w:b w:val="0"/>
-          <w:i w:val="0"/>
           <w:color w:val="000000"/>
           <w:sz w:val="19"/>
         </w:rPr>
@@ -1501,7 +1390,6 @@
         <w:rPr>
           <w:rFonts w:ascii="Arial" w:hAnsi="Arial" w:cs="Arial" w:eastAsia="Arial"/>
           <w:b/>
-          <w:i w:val="0"/>
           <w:color w:val="000000"/>
           <w:sz w:val="23"/>
         </w:rPr>
@@ -1510,14 +1398,13 @@
     </w:p>
     <w:p>
       <w:pPr>
-        <w:spacing w:before="0" w:after="0" w:line="259" w:lineRule="auto"/>
+        <w:spacing w:before="80" w:after="0" w:line="259" w:lineRule="auto"/>
         <w:jc w:val="left"/>
       </w:pPr>
       <w:r>
         <w:rPr>
           <w:rFonts w:ascii="Arial" w:hAnsi="Arial" w:cs="Arial" w:eastAsia="Arial"/>
           <w:b/>
-          <w:i w:val="0"/>
           <w:color w:val="000000"/>
           <w:sz w:val="22"/>
         </w:rPr>
@@ -1526,14 +1413,13 @@
     </w:p>
     <w:p>
       <w:pPr>
-        <w:spacing w:before="0" w:after="0" w:line="259" w:lineRule="auto"/>
+        <w:spacing w:before="0" w:after="20" w:line="259" w:lineRule="auto"/>
         <w:jc w:val="left"/>
       </w:pPr>
       <w:r>
         <w:rPr>
           <w:rFonts w:ascii="Arial" w:hAnsi="Arial" w:cs="Arial" w:eastAsia="Arial"/>
           <w:b w:val="0"/>
-          <w:i w:val="0"/>
           <w:color w:val="000000"/>
           <w:sz w:val="20"/>
         </w:rPr>
@@ -1542,14 +1428,13 @@
     </w:p>
     <w:p>
       <w:pPr>
-        <w:spacing w:before="0" w:after="40" w:line="259" w:lineRule="auto"/>
+        <w:spacing w:before="0" w:after="20" w:line="259" w:lineRule="auto"/>
         <w:jc w:val="left"/>
       </w:pPr>
       <w:r>
         <w:rPr>
           <w:rFonts w:ascii="Arial" w:hAnsi="Arial" w:cs="Arial" w:eastAsia="Arial"/>
           <w:b w:val="0"/>
-          <w:i w:val="0"/>
           <w:color w:val="000000"/>
           <w:sz w:val="20"/>
         </w:rPr>
@@ -1568,7 +1453,6 @@
         <w:rPr>
           <w:rFonts w:ascii="Arial" w:hAnsi="Arial" w:cs="Arial" w:eastAsia="Arial"/>
           <w:b/>
-          <w:i w:val="0"/>
           <w:color w:val="000000"/>
           <w:sz w:val="23"/>
         </w:rPr>
@@ -1585,7 +1469,6 @@
         <w:rPr>
           <w:rFonts w:ascii="Arial" w:hAnsi="Arial" w:cs="Arial" w:eastAsia="Arial"/>
           <w:b w:val="0"/>
-          <w:i w:val="0"/>
           <w:color w:val="000000"/>
           <w:sz w:val="20"/>
         </w:rPr>
@@ -1602,7 +1485,6 @@
         <w:rPr>
           <w:rFonts w:ascii="Arial" w:hAnsi="Arial" w:cs="Arial" w:eastAsia="Arial"/>
           <w:b w:val="0"/>
-          <w:i w:val="0"/>
           <w:color w:val="000000"/>
           <w:sz w:val="20"/>
         </w:rPr>
@@ -1621,7 +1503,6 @@
         <w:rPr>
           <w:rFonts w:ascii="Arial" w:hAnsi="Arial" w:cs="Arial" w:eastAsia="Arial"/>
           <w:b/>
-          <w:i w:val="0"/>
           <w:color w:val="000000"/>
           <w:sz w:val="23"/>
         </w:rPr>
@@ -1636,7 +1517,6 @@
         <w:rPr>
           <w:rFonts w:ascii="Arial" w:hAnsi="Arial" w:cs="Arial" w:eastAsia="Arial"/>
           <w:b/>
-          <w:i w:val="0"/>
           <w:color w:val="000000"/>
           <w:sz w:val="20"/>
         </w:rPr>
@@ -1646,7 +1526,6 @@
         <w:rPr>
           <w:rFonts w:ascii="Arial" w:hAnsi="Arial" w:cs="Arial" w:eastAsia="Arial"/>
           <w:b w:val="0"/>
-          <w:i w:val="0"/>
           <w:color w:val="000000"/>
           <w:sz w:val="20"/>
         </w:rPr>
@@ -1661,7 +1540,6 @@
         <w:rPr>
           <w:rFonts w:ascii="Arial" w:hAnsi="Arial" w:cs="Arial" w:eastAsia="Arial"/>
           <w:b/>
-          <w:i w:val="0"/>
           <w:color w:val="000000"/>
           <w:sz w:val="20"/>
         </w:rPr>
@@ -1671,7 +1549,6 @@
         <w:rPr>
           <w:rFonts w:ascii="Arial" w:hAnsi="Arial" w:cs="Arial" w:eastAsia="Arial"/>
           <w:b w:val="0"/>
-          <w:i w:val="0"/>
           <w:color w:val="000000"/>
           <w:sz w:val="20"/>
         </w:rPr>
@@ -1686,7 +1563,6 @@
         <w:rPr>
           <w:rFonts w:ascii="Arial" w:hAnsi="Arial" w:cs="Arial" w:eastAsia="Arial"/>
           <w:b/>
-          <w:i w:val="0"/>
           <w:color w:val="000000"/>
           <w:sz w:val="20"/>
         </w:rPr>
@@ -1696,7 +1572,6 @@
         <w:rPr>
           <w:rFonts w:ascii="Arial" w:hAnsi="Arial" w:cs="Arial" w:eastAsia="Arial"/>
           <w:b w:val="0"/>
-          <w:i w:val="0"/>
           <w:color w:val="000000"/>
           <w:sz w:val="20"/>
         </w:rPr>
@@ -1715,7 +1590,6 @@
         <w:rPr>
           <w:rFonts w:ascii="Arial" w:hAnsi="Arial" w:cs="Arial" w:eastAsia="Arial"/>
           <w:b/>
-          <w:i w:val="0"/>
           <w:color w:val="000000"/>
           <w:sz w:val="23"/>
         </w:rPr>
@@ -1730,7 +1604,6 @@
         <w:rPr>
           <w:rFonts w:ascii="Arial" w:hAnsi="Arial" w:cs="Arial" w:eastAsia="Arial"/>
           <w:b/>
-          <w:i w:val="0"/>
           <w:color w:val="000000"/>
           <w:sz w:val="20"/>
         </w:rPr>
@@ -1740,7 +1613,6 @@
         <w:rPr>
           <w:rFonts w:ascii="Arial" w:hAnsi="Arial" w:cs="Arial" w:eastAsia="Arial"/>
           <w:b w:val="0"/>
-          <w:i w:val="0"/>
           <w:color w:val="000000"/>
           <w:sz w:val="20"/>
         </w:rPr>

</xml_diff>

<commit_message>
fix(resume): apply review minors and name snapshots by date and type
- Content: accents in PT contact labels, L2/L3 (N2/N3) support levels in
  English, original SSP/SC ATS bullets, specific-before-generic skill order,
  churn highlight without double negative, "Stack:" label with short names
- Verifier: page-1 check matches each Java job's title line, not the company
  name (the summary also cites Cast Group and Luizalabs)
- Robustness: month outside 1-12 raises; environment errors during
  verification print without a traceback
- Tests: DOCX punctuation, committed TXT must match conteudo.py
- Snapshots: resume_lucas-bueno-cesario_<lang>_<date>_<month>_<type>.<ext>
  (humano/human PDF, ats DOCX); older ones kept as _narrativa/_narrative

Co-Authored-By: Claude Opus 5.5 <noreply@anthropic.com>
</commit_message>
<xml_diff>
--- a/Lucas-Bueno-Cesario-Curriculo-Analise.docx
+++ b/Lucas-Bueno-Cesario-Curriculo-Analise.docx
@@ -181,7 +181,7 @@
           <w:color w:val="000000"/>
           <w:sz w:val="20"/>
         </w:rPr>
-        <w:t xml:space="preserve">Pais: </w:t>
+        <w:t xml:space="preserve">País: </w:t>
       </w:r>
       <w:r>
         <w:rPr>
@@ -236,7 +236,7 @@
           <w:color w:val="000000"/>
           <w:sz w:val="20"/>
         </w:rPr>
-        <w:t>Remoto (fuso UTC-3; sobreposicao total com os EUA, parcial com a Europa)</w:t>
+        <w:t>Remoto (fuso UTC-3; sobreposição total com os EUA, parcial com a Europa)</w:t>
       </w:r>
     </w:p>
     <w:p>
@@ -440,7 +440,7 @@
           <w:color w:val="000000"/>
           <w:sz w:val="20"/>
         </w:rPr>
-        <w:t>Docker, Kubernetes, ArgoCD, Azure, Azure DevOps, Azure Blob Storage, AWS (EC2, S3, RDS), GCP, Magalu Cloud, GitLab CI/CD, Jenkins, Git, Git flow, Linux, rsync, SVN</w:t>
+        <w:t>Docker, Kubernetes, ArgoCD, Azure DevOps, Azure Blob Storage, Azure, AWS (EC2, S3, RDS), GCP, Magalu Cloud, GitLab CI/CD, Jenkins, Git flow, Git, Linux, rsync, SVN</w:t>
       </w:r>
     </w:p>
     <w:p>
@@ -1205,7 +1205,7 @@
           <w:color w:val="000000"/>
           <w:sz w:val="20"/>
         </w:rPr>
-        <w:t>Mantive sistemas legados de segurança (Bem-Te-Vi e BRAVO) em PHP e Laravel com autenticação LDAP e APIs REST sobre PostgreSQL.</w:t>
+        <w:t>Mantive sistemas legados de segurança (Bem-Te-Vi e BRAVO) em PHP com autenticação LDAP.</w:t>
       </w:r>
     </w:p>
     <w:p>
@@ -1221,7 +1221,23 @@
           <w:color w:val="000000"/>
           <w:sz w:val="20"/>
         </w:rPr>
-        <w:t>Usei RabbitMQ para mensageria assíncrona no processamento de SMS de ocorrências de placas monitoradas e integrei Elasticsearch para busca de texto completo.</w:t>
+        <w:t>Usei RabbitMQ para processamento assíncrono de SMS de ocorrências de placas monitoradas.</w:t>
+      </w:r>
+    </w:p>
+    <w:p>
+      <w:pPr>
+        <w:pStyle w:val="ListBullet"/>
+        <w:spacing w:before="0" w:after="40" w:line="259" w:lineRule="auto"/>
+        <w:ind w:left="357"/>
+      </w:pPr>
+      <w:r>
+        <w:rPr>
+          <w:rFonts w:ascii="Arial" w:hAnsi="Arial" w:cs="Arial" w:eastAsia="Arial"/>
+          <w:b w:val="0"/>
+          <w:color w:val="000000"/>
+          <w:sz w:val="20"/>
+        </w:rPr>
+        <w:t>Integrei Elasticsearch para busca de texto completo.</w:t>
       </w:r>
     </w:p>
     <w:p>

</xml_diff>